<commit_message>
docs: unify DevOps report title pages
</commit_message>
<xml_diff>
--- a/reports/2 практичка девопс.docx
+++ b/reports/2 практичка девопс.docx
@@ -4,249 +4,258 @@
   <w:body>
     <w:p>
       <w:pPr>
-        <w:spacing w:after="100"/>
+        <w:spacing w:after="0"/>
         <w:jc w:val="center"/>
+        <w:rPr>
+          <w:lang w:val="ru-RU"/>
+        </w:rPr>
       </w:pPr>
       <w:r>
         <w:rPr>
-          <w:b/>
-          <w:sz w:val="32"/>
+          <w:rFonts w:ascii="Times New Roman" w:eastAsia="Times New Roman" w:hAnsi="Times New Roman"/>
+          <w:sz w:val="24"/>
+          <w:lang w:val="ru-RU"/>
         </w:rPr>
-        <w:t>РТУ МИРЭА</w:t>
+        <w:t>МИНОБРНАУКИ РОССИИ</w:t>
       </w:r>
     </w:p>
     <w:p>
       <w:pPr>
-        <w:spacing w:after="100"/>
+        <w:spacing w:after="0"/>
         <w:jc w:val="center"/>
+        <w:rPr>
+          <w:lang w:val="ru-RU"/>
+        </w:rPr>
       </w:pPr>
       <w:r>
         <w:rPr>
-          <w:sz w:val="28"/>
+          <w:rFonts w:ascii="Times New Roman" w:eastAsia="Times New Roman" w:hAnsi="Times New Roman"/>
+          <w:lang w:val="ru-RU"/>
         </w:rPr>
-        <w:t>Кафедра индустриального программирования</w:t>
+        <w:t>Федеральное государственное бюджетное образовательное учреждение</w:t>
       </w:r>
     </w:p>
     <w:p>
       <w:pPr>
-        <w:spacing w:after="1640"/>
-      </w:pPr>
-    </w:p>
-    <w:p>
-      <w:pPr>
-        <w:pStyle w:val="aa"/>
+        <w:spacing w:after="0"/>
         <w:jc w:val="center"/>
+        <w:rPr>
+          <w:lang w:val="ru-RU"/>
+        </w:rPr>
       </w:pPr>
       <w:r>
-        <w:t>ОТЧЁТ ПО ПРАКТИЧЕСКОЙ РАБОТЕ №2</w:t>
+        <w:rPr>
+          <w:rFonts w:ascii="Times New Roman" w:eastAsia="Times New Roman" w:hAnsi="Times New Roman"/>
+          <w:lang w:val="ru-RU"/>
+        </w:rPr>
+        <w:t>высшего образования</w:t>
       </w:r>
     </w:p>
     <w:p>
       <w:pPr>
+        <w:spacing w:after="760"/>
         <w:jc w:val="center"/>
+        <w:rPr>
+          <w:lang w:val="ru-RU"/>
+        </w:rPr>
       </w:pPr>
       <w:r>
         <w:rPr>
+          <w:rFonts w:ascii="Times New Roman" w:eastAsia="Times New Roman" w:hAnsi="Times New Roman"/>
           <w:b/>
-          <w:sz w:val="30"/>
+          <w:sz w:val="24"/>
+          <w:lang w:val="ru-RU"/>
         </w:rPr>
-        <w:t>Ветвление, Pull Request и командная работа в GitHub</w:t>
+        <w:t>МИРЭА Российский технологический университет</w:t>
       </w:r>
     </w:p>
     <w:p>
       <w:pPr>
-        <w:spacing w:after="1760"/>
-      </w:pPr>
-    </w:p>
-    <w:tbl>
-      <w:tblPr>
-        <w:tblStyle w:val="aff0"/>
-        <w:tblW w:w="0" w:type="auto"/>
+        <w:spacing w:after="300"/>
         <w:jc w:val="center"/>
-        <w:tblLook w:val="04A0" w:firstRow="1" w:lastRow="0" w:firstColumn="1" w:lastColumn="0" w:noHBand="0" w:noVBand="1"/>
-      </w:tblPr>
-      <w:tblGrid>
-        <w:gridCol w:w="4839"/>
-        <w:gridCol w:w="4840"/>
-      </w:tblGrid>
-      <w:tr>
-        <w:trPr>
-          <w:jc w:val="center"/>
-        </w:trPr>
-        <w:tc>
-          <w:tcPr>
-            <w:tcW w:w="4844" w:type="dxa"/>
-            <w:shd w:val="clear" w:color="auto" w:fill="EAF1F8"/>
-            <w:vAlign w:val="center"/>
-          </w:tcPr>
-          <w:p>
-            <w:pPr>
-              <w:spacing w:after="0"/>
-            </w:pPr>
-            <w:r>
-              <w:rPr>
-                <w:b/>
-                <w:sz w:val="21"/>
-              </w:rPr>
-              <w:t>Выполнил</w:t>
-            </w:r>
-          </w:p>
-        </w:tc>
-        <w:tc>
-          <w:tcPr>
-            <w:tcW w:w="4844" w:type="dxa"/>
-            <w:vAlign w:val="center"/>
-          </w:tcPr>
-          <w:p>
-            <w:pPr>
-              <w:spacing w:after="0"/>
-            </w:pPr>
-            <w:r>
-              <w:rPr>
-                <w:sz w:val="21"/>
-              </w:rPr>
-              <w:t>Изосимов Максим Игоревич</w:t>
-            </w:r>
-          </w:p>
-        </w:tc>
-      </w:tr>
-      <w:tr>
-        <w:trPr>
-          <w:jc w:val="center"/>
-        </w:trPr>
-        <w:tc>
-          <w:tcPr>
-            <w:tcW w:w="4844" w:type="dxa"/>
-            <w:shd w:val="clear" w:color="auto" w:fill="EAF1F8"/>
-            <w:vAlign w:val="center"/>
-          </w:tcPr>
-          <w:p>
-            <w:pPr>
-              <w:spacing w:after="0"/>
-            </w:pPr>
-            <w:r>
-              <w:rPr>
-                <w:b/>
-                <w:sz w:val="21"/>
-              </w:rPr>
-              <w:t>Группа</w:t>
-            </w:r>
-          </w:p>
-        </w:tc>
-        <w:tc>
-          <w:tcPr>
-            <w:tcW w:w="4844" w:type="dxa"/>
-            <w:vAlign w:val="center"/>
-          </w:tcPr>
-          <w:p>
-            <w:pPr>
-              <w:spacing w:after="0"/>
-            </w:pPr>
-            <w:r>
-              <w:rPr>
-                <w:sz w:val="21"/>
-              </w:rPr>
-              <w:t>ЭФБО-11-24</w:t>
-            </w:r>
-          </w:p>
-        </w:tc>
-      </w:tr>
-      <w:tr>
-        <w:trPr>
-          <w:jc w:val="center"/>
-        </w:trPr>
-        <w:tc>
-          <w:tcPr>
-            <w:tcW w:w="4844" w:type="dxa"/>
-            <w:shd w:val="clear" w:color="auto" w:fill="EAF1F8"/>
-            <w:vAlign w:val="center"/>
-          </w:tcPr>
-          <w:p>
-            <w:pPr>
-              <w:spacing w:after="0"/>
-            </w:pPr>
-            <w:r>
-              <w:rPr>
-                <w:b/>
-                <w:sz w:val="21"/>
-              </w:rPr>
-              <w:t>Дисциплина</w:t>
-            </w:r>
-          </w:p>
-        </w:tc>
-        <w:tc>
-          <w:tcPr>
-            <w:tcW w:w="4844" w:type="dxa"/>
-            <w:vAlign w:val="center"/>
-          </w:tcPr>
-          <w:p>
-            <w:pPr>
-              <w:spacing w:after="0"/>
-            </w:pPr>
-            <w:r>
-              <w:rPr>
-                <w:sz w:val="21"/>
-              </w:rPr>
-              <w:t>Инструменты DevOps</w:t>
-            </w:r>
-          </w:p>
-        </w:tc>
-      </w:tr>
-      <w:tr>
-        <w:trPr>
-          <w:jc w:val="center"/>
-        </w:trPr>
-        <w:tc>
-          <w:tcPr>
-            <w:tcW w:w="4844" w:type="dxa"/>
-            <w:shd w:val="clear" w:color="auto" w:fill="EAF1F8"/>
-            <w:vAlign w:val="center"/>
-          </w:tcPr>
-          <w:p>
-            <w:pPr>
-              <w:spacing w:after="0"/>
-            </w:pPr>
-            <w:r>
-              <w:rPr>
-                <w:b/>
-                <w:sz w:val="21"/>
-              </w:rPr>
-              <w:t>Учебный год</w:t>
-            </w:r>
-          </w:p>
-        </w:tc>
-        <w:tc>
-          <w:tcPr>
-            <w:tcW w:w="4844" w:type="dxa"/>
-            <w:vAlign w:val="center"/>
-          </w:tcPr>
-          <w:p>
-            <w:pPr>
-              <w:spacing w:after="0"/>
-            </w:pPr>
-            <w:r>
-              <w:rPr>
-                <w:sz w:val="21"/>
-              </w:rPr>
-              <w:t>2026/2027</w:t>
-            </w:r>
-          </w:p>
-        </w:tc>
-      </w:tr>
-    </w:tbl>
-    <w:p>
-      <w:pPr>
-        <w:spacing w:before="360"/>
-        <w:jc w:val="center"/>
+        <w:rPr>
+          <w:lang w:val="ru-RU"/>
+        </w:rPr>
       </w:pPr>
       <w:r>
-        <w:t>Москва, 2026</w:t>
+        <w:rPr>
+          <w:rFonts w:ascii="Times New Roman" w:eastAsia="Times New Roman" w:hAnsi="Times New Roman"/>
+          <w:b/>
+          <w:sz w:val="36"/>
+          <w:lang w:val="ru-RU"/>
+        </w:rPr>
+        <w:t xml:space="preserve">ОТЧЕТ</w:t>
       </w:r>
     </w:p>
     <w:p>
+      <w:pPr>
+        <w:spacing w:after="160"/>
+        <w:jc w:val="center"/>
+        <w:rPr>
+          <w:lang w:val="ru-RU"/>
+        </w:rPr>
+      </w:pPr>
       <w:r>
-        <w:br w:type="page"/>
+        <w:rPr>
+          <w:rFonts w:ascii="Times New Roman" w:eastAsia="Times New Roman" w:hAnsi="Times New Roman"/>
+          <w:sz w:val="28"/>
+          <w:lang w:val="ru-RU"/>
+        </w:rPr>
+        <w:t xml:space="preserve">по практической работе № 2</w:t>
       </w:r>
+    </w:p>
+    <w:p>
+      <w:pPr>
+        <w:spacing w:after="160"/>
+        <w:jc w:val="center"/>
+        <w:rPr>
+          <w:lang w:val="ru-RU"/>
+        </w:rPr>
+      </w:pPr>
+      <w:r>
+        <w:rPr>
+          <w:rFonts w:ascii="Times New Roman" w:eastAsia="Times New Roman" w:hAnsi="Times New Roman"/>
+          <w:sz w:val="28"/>
+          <w:lang w:val="ru-RU"/>
+        </w:rPr>
+        <w:t xml:space="preserve">Практическая работа № 2</w:t>
+      </w:r>
+    </w:p>
+    <w:p>
+      <w:pPr>
+        <w:spacing w:after="520"/>
+        <w:jc w:val="center"/>
+        <w:rPr>
+          <w:lang w:val="ru-RU"/>
+        </w:rPr>
+      </w:pPr>
+      <w:r>
+        <w:rPr>
+          <w:rFonts w:ascii="Times New Roman" w:eastAsia="Times New Roman" w:hAnsi="Times New Roman"/>
+          <w:sz w:val="28"/>
+          <w:lang w:val="ru-RU"/>
+        </w:rPr>
+        <w:t xml:space="preserve">по дисциплине Инструменты DevOps</w:t>
+      </w:r>
+      <w:r>
+        <w:rPr>
+          <w:rFonts w:ascii="Times New Roman" w:eastAsia="Times New Roman" w:hAnsi="Times New Roman"/>
+          <w:sz w:val="28"/>
+        </w:rPr>
+        <w:t/>
+      </w:r>
+    </w:p>
+    <w:p>
+      <w:pPr>
+        <w:spacing w:after="300"/>
+        <w:rPr>
+          <w:lang w:val="ru-RU"/>
+        </w:rPr>
+      </w:pPr>
+      <w:r>
+        <w:rPr>
+          <w:rFonts w:ascii="Times New Roman" w:eastAsia="Times New Roman" w:hAnsi="Times New Roman"/>
+          <w:sz w:val="28"/>
+          <w:lang w:val="ru-RU"/>
+        </w:rPr>
+        <w:t xml:space="preserve">Тема: Ветвление, Pull Request и командная работа в GitHub</w:t>
+      </w:r>
+      <w:r>
+        <w:rPr>
+          <w:rFonts w:ascii="Times New Roman" w:eastAsia="Times New Roman" w:hAnsi="Times New Roman"/>
+          <w:sz w:val="28"/>
+        </w:rPr>
+        <w:t/>
+      </w:r>
+      <w:r>
+        <w:rPr>
+          <w:rFonts w:ascii="Times New Roman" w:eastAsia="Times New Roman" w:hAnsi="Times New Roman"/>
+          <w:sz w:val="28"/>
+          <w:lang w:val="ru-RU"/>
+        </w:rPr>
+        <w:t xml:space="preserve"/>
+      </w:r>
+      <w:proofErr w:type="spellStart"/>
+      <w:r>
+        <w:rPr>
+          <w:rFonts w:ascii="Times New Roman" w:eastAsia="Times New Roman" w:hAnsi="Times New Roman"/>
+          <w:sz w:val="28"/>
+        </w:rPr>
+        <w:t/>
+      </w:r>
+      <w:proofErr w:type="spellEnd"/>
+    </w:p>
+    <w:p>
+      <w:pPr>
+        <w:spacing w:after="360"/>
+        <w:rPr>
+          <w:lang w:val="ru-RU"/>
+        </w:rPr>
+        <w:tabs>
+          <w:tab w:val="right" w:pos="9000"/>
+        </w:tabs>
+      </w:pPr>
+      <w:r>
+        <w:rPr>
+          <w:rFonts w:ascii="Times New Roman" w:eastAsia="Times New Roman" w:hAnsi="Times New Roman"/>
+          <w:sz w:val="24"/>
+          <w:lang w:val="ru-RU"/>
+        </w:rPr>
+        <w:t xml:space="preserve">Выполнил: студент группы ЭФБО-11-24</w:t>
+      </w:r>
+      <w:r>
+        <w:rPr>
+          <w:rFonts w:ascii="Times New Roman" w:eastAsia="Times New Roman" w:hAnsi="Times New Roman"/>
+          <w:sz w:val="24"/>
+          <w:lang w:val="ru-RU"/>
+        </w:rPr>
+        <w:tab/>
+        <w:t>Изосимов Максим Игоревич</w:t>
+      </w:r>
+    </w:p>
+    <w:p>
+      <w:pPr>
+        <w:spacing w:after="840"/>
+        <w:rPr>
+          <w:lang w:val="ru-RU"/>
+        </w:rPr>
+      </w:pPr>
+      <w:r>
+        <w:rPr>
+          <w:rFonts w:ascii="Times New Roman" w:eastAsia="Times New Roman" w:hAnsi="Times New Roman"/>
+          <w:sz w:val="24"/>
+          <w:lang w:val="ru-RU"/>
+        </w:rPr>
+        <w:t xml:space="preserve">Принял: ____________________</w:t>
+      </w:r>
+    </w:p>
+    <w:p>
+      <w:pPr>
+        <w:spacing w:after="100"/>
+        <w:jc w:val="center"/>
+        <w:rPr>
+          <w:lang w:val="ru-RU"/>
+        </w:rPr>
+      </w:pPr>
+      <w:r>
+        <w:rPr>
+          <w:rFonts w:ascii="Times New Roman" w:eastAsia="Times New Roman" w:hAnsi="Times New Roman"/>
+          <w:sz w:val="26"/>
+          <w:lang w:val="ru-RU"/>
+        </w:rPr>
+        <w:t xml:space="preserve">Москва 2026</w:t>
+      </w:r>
+    </w:p>
+    <w:p>
+      <w:pPr>
+        <w:sectPr>
+          <w:type w:val="nextPage"/>
+          <w:pgSz w:w="11906" w:h="16838"/>
+          <w:pgMar w:top="1134" w:right="850" w:bottom="1134" w:left="1701" w:header="720" w:footer="720" w:gutter="0"/>
+          <w:cols w:space="720"/>
+          <w:docGrid w:linePitch="360"/>
+        </w:sectPr>
+      </w:pPr>
     </w:p>
     <w:p>
       <w:pPr>

</xml_diff>